<commit_message>
Update bagian Data Understanding bagian conclusion
</commit_message>
<xml_diff>
--- a/Document/LP-DAMI.docx
+++ b/Document/LP-DAMI.docx
@@ -2546,7 +2546,7 @@
                 <w:noProof/>
                 <w:webHidden/>
               </w:rPr>
-              <w:t>18</w:t>
+              <w:t>19</w:t>
             </w:r>
             <w:r>
               <w:rPr>
@@ -2615,7 +2615,7 @@
                 <w:noProof/>
                 <w:webHidden/>
               </w:rPr>
-              <w:t>18</w:t>
+              <w:t>19</w:t>
             </w:r>
             <w:r>
               <w:rPr>
@@ -2753,7 +2753,7 @@
                 <w:noProof/>
                 <w:webHidden/>
               </w:rPr>
-              <w:t>19</w:t>
+              <w:t>20</w:t>
             </w:r>
             <w:r>
               <w:rPr>
@@ -2893,7 +2893,7 @@
                 <w:noProof/>
                 <w:webHidden/>
               </w:rPr>
-              <w:t>20</w:t>
+              <w:t>21</w:t>
             </w:r>
             <w:r>
               <w:rPr>
@@ -2964,7 +2964,7 @@
                 <w:noProof/>
                 <w:webHidden/>
               </w:rPr>
-              <w:t>20</w:t>
+              <w:t>21</w:t>
             </w:r>
             <w:r>
               <w:rPr>
@@ -3035,7 +3035,7 @@
                 <w:noProof/>
                 <w:webHidden/>
               </w:rPr>
-              <w:t>21</w:t>
+              <w:t>22</w:t>
             </w:r>
             <w:r>
               <w:rPr>
@@ -3107,7 +3107,7 @@
                 <w:noProof/>
                 <w:webHidden/>
               </w:rPr>
-              <w:t>21</w:t>
+              <w:t>22</w:t>
             </w:r>
             <w:r>
               <w:rPr>
@@ -3179,7 +3179,7 @@
                 <w:noProof/>
                 <w:webHidden/>
               </w:rPr>
-              <w:t>22</w:t>
+              <w:t>23</w:t>
             </w:r>
             <w:r>
               <w:rPr>
@@ -3251,7 +3251,7 @@
                 <w:noProof/>
                 <w:webHidden/>
               </w:rPr>
-              <w:t>22</w:t>
+              <w:t>23</w:t>
             </w:r>
             <w:r>
               <w:rPr>
@@ -18685,6 +18685,7 @@
       <w:r>
         <w:rPr>
           <w:rFonts w:ascii="Times New Roman" w:hAnsi="Times New Roman" w:cs="Times New Roman"/>
+          <w:noProof/>
           <w:lang w:val="fi-FI"/>
         </w:rPr>
         <w:drawing>
@@ -19788,6 +19789,7 @@
             <w:r>
               <w:rPr>
                 <w:rFonts w:ascii="Times New Roman" w:hAnsi="Times New Roman" w:cs="Times New Roman"/>
+                <w:noProof/>
               </w:rPr>
               <w:drawing>
                 <wp:inline distT="0" distB="0" distL="0" distR="0" wp14:anchorId="0BD7F83B" wp14:editId="775AB125">
@@ -19882,6 +19884,7 @@
             <w:r>
               <w:rPr>
                 <w:rFonts w:ascii="Times New Roman" w:hAnsi="Times New Roman" w:cs="Times New Roman"/>
+                <w:noProof/>
               </w:rPr>
               <w:drawing>
                 <wp:inline distT="0" distB="0" distL="0" distR="0" wp14:anchorId="6D4ABDBE" wp14:editId="675E120A">
@@ -19975,6 +19978,7 @@
             <w:r>
               <w:rPr>
                 <w:rFonts w:ascii="Times New Roman" w:hAnsi="Times New Roman" w:cs="Times New Roman"/>
+                <w:noProof/>
               </w:rPr>
               <w:drawing>
                 <wp:inline distT="0" distB="0" distL="0" distR="0" wp14:anchorId="1EE6F8C1" wp14:editId="1DE1C5E7">
@@ -20070,6 +20074,7 @@
             <w:r>
               <w:rPr>
                 <w:rFonts w:ascii="Times New Roman" w:hAnsi="Times New Roman" w:cs="Times New Roman"/>
+                <w:noProof/>
               </w:rPr>
               <w:drawing>
                 <wp:inline distT="0" distB="0" distL="0" distR="0" wp14:anchorId="7971F4D3" wp14:editId="23CA2E8D">
@@ -20163,6 +20168,7 @@
             <w:r>
               <w:rPr>
                 <w:rFonts w:ascii="Times New Roman" w:hAnsi="Times New Roman" w:cs="Times New Roman"/>
+                <w:noProof/>
               </w:rPr>
               <w:drawing>
                 <wp:inline distT="0" distB="0" distL="0" distR="0" wp14:anchorId="1E68A048" wp14:editId="2ED9A174">
@@ -20257,6 +20263,7 @@
             <w:r>
               <w:rPr>
                 <w:rFonts w:ascii="Times New Roman" w:hAnsi="Times New Roman" w:cs="Times New Roman"/>
+                <w:noProof/>
               </w:rPr>
               <w:drawing>
                 <wp:inline distT="0" distB="0" distL="0" distR="0" wp14:anchorId="6E13BAED" wp14:editId="05F7037F">
@@ -20558,6 +20565,7 @@
             <w:r>
               <w:rPr>
                 <w:rFonts w:ascii="Times New Roman" w:hAnsi="Times New Roman" w:cs="Times New Roman"/>
+                <w:noProof/>
               </w:rPr>
               <w:drawing>
                 <wp:inline distT="0" distB="0" distL="0" distR="0" wp14:anchorId="6D1E406C" wp14:editId="3C9A694B">
@@ -20652,6 +20660,7 @@
             <w:r>
               <w:rPr>
                 <w:rFonts w:ascii="Times New Roman" w:hAnsi="Times New Roman" w:cs="Times New Roman"/>
+                <w:noProof/>
               </w:rPr>
               <w:drawing>
                 <wp:inline distT="0" distB="0" distL="0" distR="0" wp14:anchorId="0AC6380B" wp14:editId="7160B0A5">
@@ -20747,6 +20756,7 @@
             <w:r>
               <w:rPr>
                 <w:rFonts w:ascii="Times New Roman" w:hAnsi="Times New Roman" w:cs="Times New Roman"/>
+                <w:noProof/>
               </w:rPr>
               <w:drawing>
                 <wp:inline distT="0" distB="0" distL="0" distR="0" wp14:anchorId="2565A20E" wp14:editId="4706AD28">
@@ -20840,6 +20850,7 @@
             <w:r>
               <w:rPr>
                 <w:rFonts w:ascii="Times New Roman" w:hAnsi="Times New Roman" w:cs="Times New Roman"/>
+                <w:noProof/>
               </w:rPr>
               <w:drawing>
                 <wp:inline distT="0" distB="0" distL="0" distR="0" wp14:anchorId="662DA89A" wp14:editId="00AA0A52">
@@ -20934,6 +20945,7 @@
             <w:r>
               <w:rPr>
                 <w:rFonts w:ascii="Times New Roman" w:hAnsi="Times New Roman" w:cs="Times New Roman"/>
+                <w:noProof/>
               </w:rPr>
               <w:drawing>
                 <wp:inline distT="0" distB="0" distL="0" distR="0" wp14:anchorId="165A8E42" wp14:editId="2B1042BC">
@@ -21029,6 +21041,7 @@
             <w:r>
               <w:rPr>
                 <w:rFonts w:ascii="Times New Roman" w:hAnsi="Times New Roman" w:cs="Times New Roman"/>
+                <w:noProof/>
               </w:rPr>
               <w:drawing>
                 <wp:inline distT="0" distB="0" distL="0" distR="0" wp14:anchorId="29DCF396" wp14:editId="1C79960D">
@@ -21124,6 +21137,7 @@
             <w:r>
               <w:rPr>
                 <w:rFonts w:ascii="Times New Roman" w:hAnsi="Times New Roman" w:cs="Times New Roman"/>
+                <w:noProof/>
               </w:rPr>
               <w:drawing>
                 <wp:inline distT="0" distB="0" distL="0" distR="0" wp14:anchorId="7F7E36AA" wp14:editId="28041A52">
@@ -21219,6 +21233,7 @@
             <w:r>
               <w:rPr>
                 <w:rFonts w:ascii="Times New Roman" w:hAnsi="Times New Roman" w:cs="Times New Roman"/>
+                <w:noProof/>
               </w:rPr>
               <w:drawing>
                 <wp:inline distT="0" distB="0" distL="0" distR="0" wp14:anchorId="40729614" wp14:editId="06F45263">
@@ -21313,6 +21328,7 @@
             <w:r>
               <w:rPr>
                 <w:rFonts w:ascii="Times New Roman" w:hAnsi="Times New Roman" w:cs="Times New Roman"/>
+                <w:noProof/>
               </w:rPr>
               <w:drawing>
                 <wp:inline distT="0" distB="0" distL="0" distR="0" wp14:anchorId="660960A0" wp14:editId="10CCD0F7">
@@ -21406,6 +21422,7 @@
             <w:r>
               <w:rPr>
                 <w:rFonts w:ascii="Times New Roman" w:hAnsi="Times New Roman" w:cs="Times New Roman"/>
+                <w:noProof/>
               </w:rPr>
               <w:drawing>
                 <wp:inline distT="0" distB="0" distL="0" distR="0" wp14:anchorId="1C794A5B" wp14:editId="7426487E">
@@ -21499,6 +21516,7 @@
             <w:r>
               <w:rPr>
                 <w:rFonts w:ascii="Times New Roman" w:hAnsi="Times New Roman" w:cs="Times New Roman"/>
+                <w:noProof/>
               </w:rPr>
               <w:drawing>
                 <wp:inline distT="0" distB="0" distL="0" distR="0" wp14:anchorId="7BB7F5E4" wp14:editId="5B61303A">
@@ -21594,6 +21612,7 @@
             <w:r>
               <w:rPr>
                 <w:rFonts w:ascii="Times New Roman" w:hAnsi="Times New Roman" w:cs="Times New Roman"/>
+                <w:noProof/>
               </w:rPr>
               <w:drawing>
                 <wp:inline distT="0" distB="0" distL="0" distR="0" wp14:anchorId="3A83F969" wp14:editId="740410E6">
@@ -21688,6 +21707,7 @@
             <w:r>
               <w:rPr>
                 <w:rFonts w:ascii="Times New Roman" w:hAnsi="Times New Roman" w:cs="Times New Roman"/>
+                <w:noProof/>
               </w:rPr>
               <w:drawing>
                 <wp:inline distT="0" distB="0" distL="0" distR="0" wp14:anchorId="5B094D00" wp14:editId="0EDBE62D">
@@ -21781,6 +21801,7 @@
             <w:r>
               <w:rPr>
                 <w:rFonts w:ascii="Times New Roman" w:hAnsi="Times New Roman" w:cs="Times New Roman"/>
+                <w:noProof/>
               </w:rPr>
               <w:drawing>
                 <wp:inline distT="0" distB="0" distL="0" distR="0" wp14:anchorId="2519F26A" wp14:editId="6F758A79">
@@ -21874,6 +21895,7 @@
             <w:r>
               <w:rPr>
                 <w:rFonts w:ascii="Times New Roman" w:hAnsi="Times New Roman" w:cs="Times New Roman"/>
+                <w:noProof/>
               </w:rPr>
               <w:drawing>
                 <wp:inline distT="0" distB="0" distL="0" distR="0" wp14:anchorId="0B4E261E" wp14:editId="5018FE93">
@@ -22801,6 +22823,7 @@
       <w:r>
         <w:rPr>
           <w:rFonts w:ascii="Times New Roman" w:hAnsi="Times New Roman" w:cs="Times New Roman"/>
+          <w:noProof/>
         </w:rPr>
         <w:drawing>
           <wp:inline distT="0" distB="0" distL="0" distR="0" wp14:anchorId="69EB37A6" wp14:editId="7FC2CADF">
@@ -23478,6 +23501,7 @@
       <w:r>
         <w:rPr>
           <w:rFonts w:ascii="Times New Roman" w:hAnsi="Times New Roman" w:cs="Times New Roman"/>
+          <w:noProof/>
         </w:rPr>
         <w:drawing>
           <wp:inline distT="0" distB="0" distL="0" distR="0" wp14:anchorId="6EEDB89B" wp14:editId="30D00C38">
@@ -23779,6 +23803,7 @@
       <w:r>
         <w:rPr>
           <w:rFonts w:ascii="Times New Roman" w:hAnsi="Times New Roman" w:cs="Times New Roman"/>
+          <w:noProof/>
         </w:rPr>
         <w:drawing>
           <wp:inline distT="0" distB="0" distL="0" distR="0" wp14:anchorId="38718833" wp14:editId="7682EDC8">
@@ -23895,6 +23920,1801 @@
     </w:p>
     <w:p>
       <w:pPr>
+        <w:pStyle w:val="Heading4"/>
+        <w:numPr>
+          <w:ilvl w:val="3"/>
+          <w:numId w:val="10"/>
+        </w:numPr>
+        <w:spacing w:line="360" w:lineRule="auto"/>
+        <w:rPr>
+          <w:rFonts w:ascii="Times New Roman" w:hAnsi="Times New Roman" w:cs="Times New Roman"/>
+          <w:color w:val="auto"/>
+        </w:rPr>
+      </w:pPr>
+      <w:r>
+        <w:rPr>
+          <w:rFonts w:ascii="Times New Roman" w:hAnsi="Times New Roman" w:cs="Times New Roman"/>
+          <w:color w:val="auto"/>
+        </w:rPr>
+        <w:t>Conclusion</w:t>
+      </w:r>
+    </w:p>
+    <w:p>
+      <w:pPr>
+        <w:spacing w:after="0" w:line="360" w:lineRule="auto"/>
+        <w:jc w:val="both"/>
+        <w:rPr>
+          <w:rFonts w:ascii="Times New Roman" w:hAnsi="Times New Roman" w:cs="Times New Roman"/>
+        </w:rPr>
+      </w:pPr>
+      <w:proofErr w:type="spellStart"/>
+      <w:r>
+        <w:rPr>
+          <w:rFonts w:ascii="Times New Roman" w:hAnsi="Times New Roman" w:cs="Times New Roman"/>
+        </w:rPr>
+        <w:t>Setelah</w:t>
+      </w:r>
+      <w:proofErr w:type="spellEnd"/>
+      <w:r>
+        <w:rPr>
+          <w:rFonts w:ascii="Times New Roman" w:hAnsi="Times New Roman" w:cs="Times New Roman"/>
+        </w:rPr>
+        <w:t xml:space="preserve"> </w:t>
+      </w:r>
+      <w:proofErr w:type="spellStart"/>
+      <w:r>
+        <w:rPr>
+          <w:rFonts w:ascii="Times New Roman" w:hAnsi="Times New Roman" w:cs="Times New Roman"/>
+        </w:rPr>
+        <w:t>melakukan</w:t>
+      </w:r>
+      <w:proofErr w:type="spellEnd"/>
+      <w:r>
+        <w:rPr>
+          <w:rFonts w:ascii="Times New Roman" w:hAnsi="Times New Roman" w:cs="Times New Roman"/>
+        </w:rPr>
+        <w:t xml:space="preserve"> </w:t>
+      </w:r>
+      <w:r>
+        <w:rPr>
+          <w:rFonts w:ascii="Times New Roman" w:hAnsi="Times New Roman" w:cs="Times New Roman"/>
+          <w:i/>
+          <w:iCs/>
+        </w:rPr>
+        <w:t>data understanding</w:t>
+      </w:r>
+      <w:r>
+        <w:rPr>
+          <w:rFonts w:ascii="Times New Roman" w:hAnsi="Times New Roman" w:cs="Times New Roman"/>
+        </w:rPr>
+        <w:t xml:space="preserve"> </w:t>
+      </w:r>
+      <w:proofErr w:type="spellStart"/>
+      <w:r>
+        <w:rPr>
+          <w:rFonts w:ascii="Times New Roman" w:hAnsi="Times New Roman" w:cs="Times New Roman"/>
+        </w:rPr>
+        <w:t>terhadap</w:t>
+      </w:r>
+      <w:proofErr w:type="spellEnd"/>
+      <w:r>
+        <w:rPr>
+          <w:rFonts w:ascii="Times New Roman" w:hAnsi="Times New Roman" w:cs="Times New Roman"/>
+        </w:rPr>
+        <w:t xml:space="preserve"> data </w:t>
+      </w:r>
+      <w:proofErr w:type="spellStart"/>
+      <w:r>
+        <w:rPr>
+          <w:rFonts w:ascii="Times New Roman" w:hAnsi="Times New Roman" w:cs="Times New Roman"/>
+        </w:rPr>
+        <w:t>utama</w:t>
+      </w:r>
+      <w:proofErr w:type="spellEnd"/>
+      <w:r>
+        <w:rPr>
+          <w:rFonts w:ascii="Times New Roman" w:hAnsi="Times New Roman" w:cs="Times New Roman"/>
+        </w:rPr>
+        <w:t xml:space="preserve"> yang </w:t>
+      </w:r>
+      <w:proofErr w:type="spellStart"/>
+      <w:r>
+        <w:rPr>
+          <w:rFonts w:ascii="Times New Roman" w:hAnsi="Times New Roman" w:cs="Times New Roman"/>
+        </w:rPr>
+        <w:t>digunakan</w:t>
+      </w:r>
+      <w:proofErr w:type="spellEnd"/>
+      <w:r>
+        <w:rPr>
+          <w:rFonts w:ascii="Times New Roman" w:hAnsi="Times New Roman" w:cs="Times New Roman"/>
+        </w:rPr>
+        <w:t xml:space="preserve">, </w:t>
+      </w:r>
+      <w:proofErr w:type="spellStart"/>
+      <w:r>
+        <w:rPr>
+          <w:rFonts w:ascii="Times New Roman" w:hAnsi="Times New Roman" w:cs="Times New Roman"/>
+        </w:rPr>
+        <w:t>maka</w:t>
+      </w:r>
+      <w:proofErr w:type="spellEnd"/>
+      <w:r>
+        <w:rPr>
+          <w:rFonts w:ascii="Times New Roman" w:hAnsi="Times New Roman" w:cs="Times New Roman"/>
+        </w:rPr>
+        <w:t xml:space="preserve"> </w:t>
+      </w:r>
+      <w:proofErr w:type="spellStart"/>
+      <w:r>
+        <w:rPr>
+          <w:rFonts w:ascii="Times New Roman" w:hAnsi="Times New Roman" w:cs="Times New Roman"/>
+        </w:rPr>
+        <w:t>dengan</w:t>
+      </w:r>
+      <w:proofErr w:type="spellEnd"/>
+      <w:r>
+        <w:rPr>
+          <w:rFonts w:ascii="Times New Roman" w:hAnsi="Times New Roman" w:cs="Times New Roman"/>
+        </w:rPr>
+        <w:t xml:space="preserve"> </w:t>
+      </w:r>
+      <w:proofErr w:type="spellStart"/>
+      <w:r>
+        <w:rPr>
+          <w:rFonts w:ascii="Times New Roman" w:hAnsi="Times New Roman" w:cs="Times New Roman"/>
+        </w:rPr>
+        <w:t>ini</w:t>
+      </w:r>
+      <w:proofErr w:type="spellEnd"/>
+      <w:r>
+        <w:rPr>
+          <w:rFonts w:ascii="Times New Roman" w:hAnsi="Times New Roman" w:cs="Times New Roman"/>
+        </w:rPr>
+        <w:t xml:space="preserve"> kami </w:t>
+      </w:r>
+      <w:proofErr w:type="spellStart"/>
+      <w:r>
+        <w:rPr>
+          <w:rFonts w:ascii="Times New Roman" w:hAnsi="Times New Roman" w:cs="Times New Roman"/>
+        </w:rPr>
+        <w:t>memutuskan</w:t>
+      </w:r>
+      <w:proofErr w:type="spellEnd"/>
+      <w:r>
+        <w:rPr>
+          <w:rFonts w:ascii="Times New Roman" w:hAnsi="Times New Roman" w:cs="Times New Roman"/>
+        </w:rPr>
+        <w:t xml:space="preserve"> </w:t>
+      </w:r>
+      <w:proofErr w:type="spellStart"/>
+      <w:r>
+        <w:rPr>
+          <w:rFonts w:ascii="Times New Roman" w:hAnsi="Times New Roman" w:cs="Times New Roman"/>
+        </w:rPr>
+        <w:t>untuk</w:t>
+      </w:r>
+      <w:proofErr w:type="spellEnd"/>
+      <w:r>
+        <w:rPr>
+          <w:rFonts w:ascii="Times New Roman" w:hAnsi="Times New Roman" w:cs="Times New Roman"/>
+        </w:rPr>
+        <w:t xml:space="preserve"> </w:t>
+      </w:r>
+      <w:proofErr w:type="spellStart"/>
+      <w:r>
+        <w:rPr>
+          <w:rFonts w:ascii="Times New Roman" w:hAnsi="Times New Roman" w:cs="Times New Roman"/>
+        </w:rPr>
+        <w:t>menggunakan</w:t>
+      </w:r>
+      <w:proofErr w:type="spellEnd"/>
+      <w:r>
+        <w:rPr>
+          <w:rFonts w:ascii="Times New Roman" w:hAnsi="Times New Roman" w:cs="Times New Roman"/>
+        </w:rPr>
+        <w:t xml:space="preserve"> </w:t>
+      </w:r>
+      <w:proofErr w:type="spellStart"/>
+      <w:r>
+        <w:rPr>
+          <w:rFonts w:ascii="Times New Roman" w:hAnsi="Times New Roman" w:cs="Times New Roman"/>
+        </w:rPr>
+        <w:t>atribut-atribut</w:t>
+      </w:r>
+      <w:proofErr w:type="spellEnd"/>
+      <w:r>
+        <w:rPr>
+          <w:rFonts w:ascii="Times New Roman" w:hAnsi="Times New Roman" w:cs="Times New Roman"/>
+        </w:rPr>
+        <w:t xml:space="preserve"> </w:t>
+      </w:r>
+      <w:proofErr w:type="spellStart"/>
+      <w:r>
+        <w:rPr>
+          <w:rFonts w:ascii="Times New Roman" w:hAnsi="Times New Roman" w:cs="Times New Roman"/>
+        </w:rPr>
+        <w:t>berikut</w:t>
+      </w:r>
+      <w:proofErr w:type="spellEnd"/>
+      <w:r>
+        <w:rPr>
+          <w:rFonts w:ascii="Times New Roman" w:hAnsi="Times New Roman" w:cs="Times New Roman"/>
+        </w:rPr>
+        <w:t xml:space="preserve"> </w:t>
+      </w:r>
+      <w:proofErr w:type="spellStart"/>
+      <w:r>
+        <w:rPr>
+          <w:rFonts w:ascii="Times New Roman" w:hAnsi="Times New Roman" w:cs="Times New Roman"/>
+        </w:rPr>
+        <w:t>sebagai</w:t>
+      </w:r>
+      <w:proofErr w:type="spellEnd"/>
+      <w:r>
+        <w:rPr>
+          <w:rFonts w:ascii="Times New Roman" w:hAnsi="Times New Roman" w:cs="Times New Roman"/>
+        </w:rPr>
+        <w:t xml:space="preserve"> </w:t>
+      </w:r>
+      <w:r>
+        <w:rPr>
+          <w:rFonts w:ascii="Times New Roman" w:hAnsi="Times New Roman" w:cs="Times New Roman"/>
+          <w:i/>
+          <w:iCs/>
+        </w:rPr>
+        <w:t>feature</w:t>
+      </w:r>
+      <w:r>
+        <w:rPr>
+          <w:rFonts w:ascii="Times New Roman" w:hAnsi="Times New Roman" w:cs="Times New Roman"/>
+        </w:rPr>
+        <w:t xml:space="preserve"> dan target </w:t>
+      </w:r>
+      <w:proofErr w:type="spellStart"/>
+      <w:r>
+        <w:rPr>
+          <w:rFonts w:ascii="Times New Roman" w:hAnsi="Times New Roman" w:cs="Times New Roman"/>
+        </w:rPr>
+        <w:t>untuk</w:t>
+      </w:r>
+      <w:proofErr w:type="spellEnd"/>
+      <w:r>
+        <w:rPr>
+          <w:rFonts w:ascii="Times New Roman" w:hAnsi="Times New Roman" w:cs="Times New Roman"/>
+        </w:rPr>
+        <w:t xml:space="preserve"> </w:t>
+      </w:r>
+      <w:proofErr w:type="spellStart"/>
+      <w:r>
+        <w:rPr>
+          <w:rFonts w:ascii="Times New Roman" w:hAnsi="Times New Roman" w:cs="Times New Roman"/>
+        </w:rPr>
+        <w:t>melatih</w:t>
+      </w:r>
+      <w:proofErr w:type="spellEnd"/>
+      <w:r>
+        <w:rPr>
+          <w:rFonts w:ascii="Times New Roman" w:hAnsi="Times New Roman" w:cs="Times New Roman"/>
+        </w:rPr>
+        <w:t xml:space="preserve"> model </w:t>
+      </w:r>
+      <w:proofErr w:type="spellStart"/>
+      <w:r>
+        <w:rPr>
+          <w:rFonts w:ascii="Times New Roman" w:hAnsi="Times New Roman" w:cs="Times New Roman"/>
+        </w:rPr>
+        <w:t>dalam</w:t>
+      </w:r>
+      <w:proofErr w:type="spellEnd"/>
+      <w:r>
+        <w:rPr>
+          <w:rFonts w:ascii="Times New Roman" w:hAnsi="Times New Roman" w:cs="Times New Roman"/>
+        </w:rPr>
+        <w:t xml:space="preserve"> </w:t>
+      </w:r>
+      <w:proofErr w:type="spellStart"/>
+      <w:r>
+        <w:rPr>
+          <w:rFonts w:ascii="Times New Roman" w:hAnsi="Times New Roman" w:cs="Times New Roman"/>
+        </w:rPr>
+        <w:t>mengklasifikasikan</w:t>
+      </w:r>
+      <w:proofErr w:type="spellEnd"/>
+      <w:r>
+        <w:rPr>
+          <w:rFonts w:ascii="Times New Roman" w:hAnsi="Times New Roman" w:cs="Times New Roman"/>
+        </w:rPr>
+        <w:t xml:space="preserve"> </w:t>
+      </w:r>
+      <w:proofErr w:type="spellStart"/>
+      <w:r>
+        <w:rPr>
+          <w:rFonts w:ascii="Times New Roman" w:hAnsi="Times New Roman" w:cs="Times New Roman"/>
+        </w:rPr>
+        <w:t>prediksi</w:t>
+      </w:r>
+      <w:proofErr w:type="spellEnd"/>
+      <w:r>
+        <w:rPr>
+          <w:rFonts w:ascii="Times New Roman" w:hAnsi="Times New Roman" w:cs="Times New Roman"/>
+        </w:rPr>
+        <w:t xml:space="preserve"> </w:t>
+      </w:r>
+      <w:proofErr w:type="spellStart"/>
+      <w:r>
+        <w:rPr>
+          <w:rFonts w:ascii="Times New Roman" w:hAnsi="Times New Roman" w:cs="Times New Roman"/>
+        </w:rPr>
+        <w:t>kunjungan</w:t>
+      </w:r>
+      <w:proofErr w:type="spellEnd"/>
+      <w:r>
+        <w:rPr>
+          <w:rFonts w:ascii="Times New Roman" w:hAnsi="Times New Roman" w:cs="Times New Roman"/>
+        </w:rPr>
+        <w:t xml:space="preserve"> </w:t>
+      </w:r>
+      <w:proofErr w:type="spellStart"/>
+      <w:r>
+        <w:rPr>
+          <w:rFonts w:ascii="Times New Roman" w:hAnsi="Times New Roman" w:cs="Times New Roman"/>
+        </w:rPr>
+        <w:t>sehat</w:t>
+      </w:r>
+      <w:proofErr w:type="spellEnd"/>
+      <w:r>
+        <w:rPr>
+          <w:rFonts w:ascii="Times New Roman" w:hAnsi="Times New Roman" w:cs="Times New Roman"/>
+        </w:rPr>
+        <w:t xml:space="preserve"> </w:t>
+      </w:r>
+      <w:proofErr w:type="spellStart"/>
+      <w:r>
+        <w:rPr>
+          <w:rFonts w:ascii="Times New Roman" w:hAnsi="Times New Roman" w:cs="Times New Roman"/>
+        </w:rPr>
+        <w:t>atau</w:t>
+      </w:r>
+      <w:proofErr w:type="spellEnd"/>
+      <w:r>
+        <w:rPr>
+          <w:rFonts w:ascii="Times New Roman" w:hAnsi="Times New Roman" w:cs="Times New Roman"/>
+        </w:rPr>
+        <w:t xml:space="preserve"> </w:t>
+      </w:r>
+      <w:proofErr w:type="spellStart"/>
+      <w:r>
+        <w:rPr>
+          <w:rFonts w:ascii="Times New Roman" w:hAnsi="Times New Roman" w:cs="Times New Roman"/>
+        </w:rPr>
+        <w:t>sakit</w:t>
+      </w:r>
+      <w:proofErr w:type="spellEnd"/>
+      <w:r>
+        <w:rPr>
+          <w:rFonts w:ascii="Times New Roman" w:hAnsi="Times New Roman" w:cs="Times New Roman"/>
+        </w:rPr>
+        <w:t xml:space="preserve">. </w:t>
+      </w:r>
+      <w:proofErr w:type="spellStart"/>
+      <w:r>
+        <w:rPr>
+          <w:rFonts w:ascii="Times New Roman" w:hAnsi="Times New Roman" w:cs="Times New Roman"/>
+        </w:rPr>
+        <w:t>Atribut-atribut</w:t>
+      </w:r>
+      <w:proofErr w:type="spellEnd"/>
+      <w:r>
+        <w:rPr>
+          <w:rFonts w:ascii="Times New Roman" w:hAnsi="Times New Roman" w:cs="Times New Roman"/>
+        </w:rPr>
+        <w:t xml:space="preserve"> </w:t>
+      </w:r>
+      <w:proofErr w:type="spellStart"/>
+      <w:r>
+        <w:rPr>
+          <w:rFonts w:ascii="Times New Roman" w:hAnsi="Times New Roman" w:cs="Times New Roman"/>
+        </w:rPr>
+        <w:t>ini</w:t>
+      </w:r>
+      <w:proofErr w:type="spellEnd"/>
+      <w:r>
+        <w:rPr>
+          <w:rFonts w:ascii="Times New Roman" w:hAnsi="Times New Roman" w:cs="Times New Roman"/>
+        </w:rPr>
+        <w:t xml:space="preserve"> </w:t>
+      </w:r>
+      <w:proofErr w:type="spellStart"/>
+      <w:r>
+        <w:rPr>
+          <w:rFonts w:ascii="Times New Roman" w:hAnsi="Times New Roman" w:cs="Times New Roman"/>
+        </w:rPr>
+        <w:t>terdiri</w:t>
+      </w:r>
+      <w:proofErr w:type="spellEnd"/>
+      <w:r>
+        <w:rPr>
+          <w:rFonts w:ascii="Times New Roman" w:hAnsi="Times New Roman" w:cs="Times New Roman"/>
+        </w:rPr>
+        <w:t xml:space="preserve"> </w:t>
+      </w:r>
+      <w:proofErr w:type="spellStart"/>
+      <w:r>
+        <w:rPr>
+          <w:rFonts w:ascii="Times New Roman" w:hAnsi="Times New Roman" w:cs="Times New Roman"/>
+        </w:rPr>
+        <w:t>atas</w:t>
+      </w:r>
+      <w:proofErr w:type="spellEnd"/>
+      <w:r>
+        <w:rPr>
+          <w:rFonts w:ascii="Times New Roman" w:hAnsi="Times New Roman" w:cs="Times New Roman"/>
+        </w:rPr>
+        <w:t xml:space="preserve"> </w:t>
+      </w:r>
+      <w:proofErr w:type="spellStart"/>
+      <w:r>
+        <w:rPr>
+          <w:rFonts w:ascii="Times New Roman" w:hAnsi="Times New Roman" w:cs="Times New Roman"/>
+        </w:rPr>
+        <w:t>atribut</w:t>
+      </w:r>
+      <w:proofErr w:type="spellEnd"/>
+      <w:r>
+        <w:rPr>
+          <w:rFonts w:ascii="Times New Roman" w:hAnsi="Times New Roman" w:cs="Times New Roman"/>
+        </w:rPr>
+        <w:t xml:space="preserve"> </w:t>
+      </w:r>
+      <w:proofErr w:type="spellStart"/>
+      <w:r>
+        <w:rPr>
+          <w:rFonts w:ascii="Times New Roman" w:hAnsi="Times New Roman" w:cs="Times New Roman"/>
+        </w:rPr>
+        <w:t>numerik</w:t>
+      </w:r>
+      <w:proofErr w:type="spellEnd"/>
+      <w:r>
+        <w:rPr>
+          <w:rFonts w:ascii="Times New Roman" w:hAnsi="Times New Roman" w:cs="Times New Roman"/>
+        </w:rPr>
+        <w:t xml:space="preserve"> dan </w:t>
+      </w:r>
+      <w:proofErr w:type="spellStart"/>
+      <w:r>
+        <w:rPr>
+          <w:rFonts w:ascii="Times New Roman" w:hAnsi="Times New Roman" w:cs="Times New Roman"/>
+        </w:rPr>
+        <w:t>k</w:t>
+      </w:r>
+      <w:r>
+        <w:rPr>
+          <w:rFonts w:ascii="Times New Roman" w:hAnsi="Times New Roman" w:cs="Times New Roman"/>
+        </w:rPr>
+        <w:t>ategori</w:t>
+      </w:r>
+      <w:r>
+        <w:rPr>
+          <w:rFonts w:ascii="Times New Roman" w:hAnsi="Times New Roman" w:cs="Times New Roman"/>
+        </w:rPr>
+        <w:t>k</w:t>
+      </w:r>
+      <w:r>
+        <w:rPr>
+          <w:rFonts w:ascii="Times New Roman" w:hAnsi="Times New Roman" w:cs="Times New Roman"/>
+        </w:rPr>
+        <w:t>al</w:t>
+      </w:r>
+      <w:proofErr w:type="spellEnd"/>
+      <w:r>
+        <w:rPr>
+          <w:rFonts w:ascii="Times New Roman" w:hAnsi="Times New Roman" w:cs="Times New Roman"/>
+        </w:rPr>
+        <w:t xml:space="preserve"> </w:t>
+      </w:r>
+      <w:proofErr w:type="spellStart"/>
+      <w:r>
+        <w:rPr>
+          <w:rFonts w:ascii="Times New Roman" w:hAnsi="Times New Roman" w:cs="Times New Roman"/>
+        </w:rPr>
+        <w:t>yaitu</w:t>
+      </w:r>
+      <w:proofErr w:type="spellEnd"/>
+      <w:r>
+        <w:rPr>
+          <w:rFonts w:ascii="Times New Roman" w:hAnsi="Times New Roman" w:cs="Times New Roman"/>
+        </w:rPr>
+        <w:t>:</w:t>
+      </w:r>
+    </w:p>
+    <w:p>
+      <w:pPr>
+        <w:pStyle w:val="ListParagraph"/>
+        <w:numPr>
+          <w:ilvl w:val="1"/>
+          <w:numId w:val="9"/>
+        </w:numPr>
+        <w:spacing w:line="360" w:lineRule="auto"/>
+        <w:ind w:left="426"/>
+        <w:jc w:val="both"/>
+        <w:rPr>
+          <w:rFonts w:ascii="Times New Roman" w:hAnsi="Times New Roman" w:cs="Times New Roman"/>
+        </w:rPr>
+      </w:pPr>
+      <w:r>
+        <w:rPr>
+          <w:rFonts w:ascii="Times New Roman" w:hAnsi="Times New Roman" w:cs="Times New Roman"/>
+        </w:rPr>
+        <w:t>FKP05</w:t>
+      </w:r>
+    </w:p>
+    <w:p>
+      <w:pPr>
+        <w:pStyle w:val="ListParagraph"/>
+        <w:numPr>
+          <w:ilvl w:val="1"/>
+          <w:numId w:val="9"/>
+        </w:numPr>
+        <w:spacing w:line="360" w:lineRule="auto"/>
+        <w:ind w:left="426"/>
+        <w:jc w:val="both"/>
+        <w:rPr>
+          <w:rFonts w:ascii="Times New Roman" w:hAnsi="Times New Roman" w:cs="Times New Roman"/>
+        </w:rPr>
+      </w:pPr>
+      <w:r>
+        <w:rPr>
+          <w:rFonts w:ascii="Times New Roman" w:hAnsi="Times New Roman" w:cs="Times New Roman"/>
+        </w:rPr>
+        <w:t>FKP11</w:t>
+      </w:r>
+    </w:p>
+    <w:p>
+      <w:pPr>
+        <w:pStyle w:val="ListParagraph"/>
+        <w:numPr>
+          <w:ilvl w:val="1"/>
+          <w:numId w:val="9"/>
+        </w:numPr>
+        <w:spacing w:line="360" w:lineRule="auto"/>
+        <w:ind w:left="426"/>
+        <w:jc w:val="both"/>
+        <w:rPr>
+          <w:rFonts w:ascii="Times New Roman" w:hAnsi="Times New Roman" w:cs="Times New Roman"/>
+        </w:rPr>
+      </w:pPr>
+      <w:r>
+        <w:rPr>
+          <w:rFonts w:ascii="Times New Roman" w:hAnsi="Times New Roman" w:cs="Times New Roman"/>
+        </w:rPr>
+        <w:t>FKP13</w:t>
+      </w:r>
+    </w:p>
+    <w:p>
+      <w:pPr>
+        <w:pStyle w:val="ListParagraph"/>
+        <w:numPr>
+          <w:ilvl w:val="1"/>
+          <w:numId w:val="9"/>
+        </w:numPr>
+        <w:spacing w:line="360" w:lineRule="auto"/>
+        <w:ind w:left="426"/>
+        <w:jc w:val="both"/>
+        <w:rPr>
+          <w:rFonts w:ascii="Times New Roman" w:hAnsi="Times New Roman" w:cs="Times New Roman"/>
+        </w:rPr>
+      </w:pPr>
+      <w:r>
+        <w:rPr>
+          <w:rFonts w:ascii="Times New Roman" w:hAnsi="Times New Roman" w:cs="Times New Roman"/>
+        </w:rPr>
+        <w:t>FKP14</w:t>
+      </w:r>
+    </w:p>
+    <w:p>
+      <w:pPr>
+        <w:pStyle w:val="ListParagraph"/>
+        <w:numPr>
+          <w:ilvl w:val="1"/>
+          <w:numId w:val="9"/>
+        </w:numPr>
+        <w:spacing w:line="360" w:lineRule="auto"/>
+        <w:ind w:left="426"/>
+        <w:jc w:val="both"/>
+        <w:rPr>
+          <w:rFonts w:ascii="Times New Roman" w:hAnsi="Times New Roman" w:cs="Times New Roman"/>
+        </w:rPr>
+      </w:pPr>
+      <w:r>
+        <w:rPr>
+          <w:rFonts w:ascii="Times New Roman" w:hAnsi="Times New Roman" w:cs="Times New Roman"/>
+        </w:rPr>
+        <w:t>FKP14A</w:t>
+      </w:r>
+    </w:p>
+    <w:p>
+      <w:pPr>
+        <w:pStyle w:val="ListParagraph"/>
+        <w:numPr>
+          <w:ilvl w:val="1"/>
+          <w:numId w:val="9"/>
+        </w:numPr>
+        <w:spacing w:line="360" w:lineRule="auto"/>
+        <w:ind w:left="426"/>
+        <w:jc w:val="both"/>
+        <w:rPr>
+          <w:rFonts w:ascii="Times New Roman" w:hAnsi="Times New Roman" w:cs="Times New Roman"/>
+        </w:rPr>
+      </w:pPr>
+      <w:r>
+        <w:rPr>
+          <w:rFonts w:ascii="Times New Roman" w:hAnsi="Times New Roman" w:cs="Times New Roman"/>
+        </w:rPr>
+        <w:t>FKP15</w:t>
+      </w:r>
+    </w:p>
+    <w:p>
+      <w:pPr>
+        <w:pStyle w:val="ListParagraph"/>
+        <w:numPr>
+          <w:ilvl w:val="1"/>
+          <w:numId w:val="9"/>
+        </w:numPr>
+        <w:spacing w:line="360" w:lineRule="auto"/>
+        <w:ind w:left="426"/>
+        <w:jc w:val="both"/>
+        <w:rPr>
+          <w:rFonts w:ascii="Times New Roman" w:hAnsi="Times New Roman" w:cs="Times New Roman"/>
+        </w:rPr>
+      </w:pPr>
+      <w:r>
+        <w:rPr>
+          <w:rFonts w:ascii="Times New Roman" w:hAnsi="Times New Roman" w:cs="Times New Roman"/>
+        </w:rPr>
+        <w:t>FKP15A</w:t>
+      </w:r>
+    </w:p>
+    <w:p>
+      <w:pPr>
+        <w:pStyle w:val="ListParagraph"/>
+        <w:numPr>
+          <w:ilvl w:val="1"/>
+          <w:numId w:val="9"/>
+        </w:numPr>
+        <w:spacing w:after="0" w:line="360" w:lineRule="auto"/>
+        <w:ind w:left="426"/>
+        <w:jc w:val="both"/>
+        <w:rPr>
+          <w:rFonts w:ascii="Times New Roman" w:hAnsi="Times New Roman" w:cs="Times New Roman"/>
+        </w:rPr>
+      </w:pPr>
+      <w:r>
+        <w:rPr>
+          <w:rFonts w:ascii="Times New Roman" w:hAnsi="Times New Roman" w:cs="Times New Roman"/>
+        </w:rPr>
+        <w:t>FKP22</w:t>
+      </w:r>
+    </w:p>
+    <w:p>
+      <w:pPr>
+        <w:spacing w:line="360" w:lineRule="auto"/>
+        <w:jc w:val="both"/>
+        <w:rPr>
+          <w:rFonts w:ascii="Times New Roman" w:hAnsi="Times New Roman" w:cs="Times New Roman"/>
+        </w:rPr>
+      </w:pPr>
+      <w:proofErr w:type="spellStart"/>
+      <w:r>
+        <w:rPr>
+          <w:rFonts w:ascii="Times New Roman" w:hAnsi="Times New Roman" w:cs="Times New Roman"/>
+        </w:rPr>
+        <w:t>Pemilihan</w:t>
+      </w:r>
+      <w:proofErr w:type="spellEnd"/>
+      <w:r>
+        <w:rPr>
+          <w:rFonts w:ascii="Times New Roman" w:hAnsi="Times New Roman" w:cs="Times New Roman"/>
+        </w:rPr>
+        <w:t xml:space="preserve"> </w:t>
+      </w:r>
+      <w:proofErr w:type="spellStart"/>
+      <w:r>
+        <w:rPr>
+          <w:rFonts w:ascii="Times New Roman" w:hAnsi="Times New Roman" w:cs="Times New Roman"/>
+        </w:rPr>
+        <w:t>atribut-atribut</w:t>
+      </w:r>
+      <w:proofErr w:type="spellEnd"/>
+      <w:r>
+        <w:rPr>
+          <w:rFonts w:ascii="Times New Roman" w:hAnsi="Times New Roman" w:cs="Times New Roman"/>
+        </w:rPr>
+        <w:t xml:space="preserve"> </w:t>
+      </w:r>
+      <w:proofErr w:type="spellStart"/>
+      <w:r>
+        <w:rPr>
+          <w:rFonts w:ascii="Times New Roman" w:hAnsi="Times New Roman" w:cs="Times New Roman"/>
+        </w:rPr>
+        <w:t>ini</w:t>
+      </w:r>
+      <w:proofErr w:type="spellEnd"/>
+      <w:r>
+        <w:rPr>
+          <w:rFonts w:ascii="Times New Roman" w:hAnsi="Times New Roman" w:cs="Times New Roman"/>
+        </w:rPr>
+        <w:t xml:space="preserve"> </w:t>
+      </w:r>
+      <w:proofErr w:type="spellStart"/>
+      <w:r>
+        <w:rPr>
+          <w:rFonts w:ascii="Times New Roman" w:hAnsi="Times New Roman" w:cs="Times New Roman"/>
+        </w:rPr>
+        <w:t>berlatarkan</w:t>
+      </w:r>
+      <w:proofErr w:type="spellEnd"/>
+      <w:r>
+        <w:rPr>
+          <w:rFonts w:ascii="Times New Roman" w:hAnsi="Times New Roman" w:cs="Times New Roman"/>
+        </w:rPr>
+        <w:t xml:space="preserve"> </w:t>
+      </w:r>
+      <w:proofErr w:type="spellStart"/>
+      <w:r>
+        <w:rPr>
+          <w:rFonts w:ascii="Times New Roman" w:hAnsi="Times New Roman" w:cs="Times New Roman"/>
+        </w:rPr>
+        <w:t>berbagai</w:t>
+      </w:r>
+      <w:proofErr w:type="spellEnd"/>
+      <w:r>
+        <w:rPr>
+          <w:rFonts w:ascii="Times New Roman" w:hAnsi="Times New Roman" w:cs="Times New Roman"/>
+        </w:rPr>
+        <w:t xml:space="preserve"> </w:t>
+      </w:r>
+      <w:proofErr w:type="spellStart"/>
+      <w:r>
+        <w:rPr>
+          <w:rFonts w:ascii="Times New Roman" w:hAnsi="Times New Roman" w:cs="Times New Roman"/>
+        </w:rPr>
+        <w:t>alasan</w:t>
+      </w:r>
+      <w:proofErr w:type="spellEnd"/>
+      <w:r>
+        <w:rPr>
+          <w:rFonts w:ascii="Times New Roman" w:hAnsi="Times New Roman" w:cs="Times New Roman"/>
+        </w:rPr>
+        <w:t xml:space="preserve"> yang </w:t>
+      </w:r>
+      <w:proofErr w:type="spellStart"/>
+      <w:r>
+        <w:rPr>
+          <w:rFonts w:ascii="Times New Roman" w:hAnsi="Times New Roman" w:cs="Times New Roman"/>
+        </w:rPr>
+        <w:t>diantaranya</w:t>
+      </w:r>
+      <w:proofErr w:type="spellEnd"/>
+      <w:r>
+        <w:rPr>
+          <w:rFonts w:ascii="Times New Roman" w:hAnsi="Times New Roman" w:cs="Times New Roman"/>
+        </w:rPr>
+        <w:t xml:space="preserve"> </w:t>
+      </w:r>
+      <w:proofErr w:type="spellStart"/>
+      <w:r>
+        <w:rPr>
+          <w:rFonts w:ascii="Times New Roman" w:hAnsi="Times New Roman" w:cs="Times New Roman"/>
+        </w:rPr>
+        <w:t>adalah</w:t>
+      </w:r>
+      <w:proofErr w:type="spellEnd"/>
+      <w:r>
+        <w:rPr>
+          <w:rFonts w:ascii="Times New Roman" w:hAnsi="Times New Roman" w:cs="Times New Roman"/>
+        </w:rPr>
+        <w:t xml:space="preserve"> </w:t>
+      </w:r>
+      <w:proofErr w:type="spellStart"/>
+      <w:r>
+        <w:rPr>
+          <w:rFonts w:ascii="Times New Roman" w:hAnsi="Times New Roman" w:cs="Times New Roman"/>
+        </w:rPr>
+        <w:t>korelasi</w:t>
+      </w:r>
+      <w:proofErr w:type="spellEnd"/>
+      <w:r>
+        <w:rPr>
+          <w:rFonts w:ascii="Times New Roman" w:hAnsi="Times New Roman" w:cs="Times New Roman"/>
+        </w:rPr>
+        <w:t xml:space="preserve"> </w:t>
+      </w:r>
+      <w:proofErr w:type="spellStart"/>
+      <w:r>
+        <w:rPr>
+          <w:rFonts w:ascii="Times New Roman" w:hAnsi="Times New Roman" w:cs="Times New Roman"/>
+        </w:rPr>
+        <w:t>tinggi</w:t>
+      </w:r>
+      <w:proofErr w:type="spellEnd"/>
+      <w:r>
+        <w:rPr>
+          <w:rFonts w:ascii="Times New Roman" w:hAnsi="Times New Roman" w:cs="Times New Roman"/>
+        </w:rPr>
+        <w:t xml:space="preserve"> </w:t>
+      </w:r>
+      <w:proofErr w:type="spellStart"/>
+      <w:r>
+        <w:rPr>
+          <w:rFonts w:ascii="Times New Roman" w:hAnsi="Times New Roman" w:cs="Times New Roman"/>
+        </w:rPr>
+        <w:t>antara</w:t>
+      </w:r>
+      <w:proofErr w:type="spellEnd"/>
+      <w:r>
+        <w:rPr>
+          <w:rFonts w:ascii="Times New Roman" w:hAnsi="Times New Roman" w:cs="Times New Roman"/>
+        </w:rPr>
+        <w:t xml:space="preserve"> </w:t>
+      </w:r>
+      <w:proofErr w:type="spellStart"/>
+      <w:r>
+        <w:rPr>
+          <w:rFonts w:ascii="Times New Roman" w:hAnsi="Times New Roman" w:cs="Times New Roman"/>
+        </w:rPr>
+        <w:t>atribut</w:t>
+      </w:r>
+      <w:proofErr w:type="spellEnd"/>
+      <w:r>
+        <w:rPr>
+          <w:rFonts w:ascii="Times New Roman" w:hAnsi="Times New Roman" w:cs="Times New Roman"/>
+        </w:rPr>
+        <w:t xml:space="preserve"> </w:t>
+      </w:r>
+      <w:proofErr w:type="spellStart"/>
+      <w:r>
+        <w:rPr>
+          <w:rFonts w:ascii="Times New Roman" w:hAnsi="Times New Roman" w:cs="Times New Roman"/>
+        </w:rPr>
+        <w:t>dengan</w:t>
+      </w:r>
+      <w:proofErr w:type="spellEnd"/>
+      <w:r>
+        <w:rPr>
+          <w:rFonts w:ascii="Times New Roman" w:hAnsi="Times New Roman" w:cs="Times New Roman"/>
+        </w:rPr>
+        <w:t xml:space="preserve"> </w:t>
+      </w:r>
+      <w:proofErr w:type="spellStart"/>
+      <w:r>
+        <w:rPr>
+          <w:rFonts w:ascii="Times New Roman" w:hAnsi="Times New Roman" w:cs="Times New Roman"/>
+        </w:rPr>
+        <w:t>atribut</w:t>
+      </w:r>
+      <w:proofErr w:type="spellEnd"/>
+      <w:r>
+        <w:rPr>
+          <w:rFonts w:ascii="Times New Roman" w:hAnsi="Times New Roman" w:cs="Times New Roman"/>
+        </w:rPr>
+        <w:t xml:space="preserve"> target, </w:t>
+      </w:r>
+      <w:proofErr w:type="spellStart"/>
+      <w:r>
+        <w:rPr>
+          <w:rFonts w:ascii="Times New Roman" w:hAnsi="Times New Roman" w:cs="Times New Roman"/>
+        </w:rPr>
+        <w:t>manfaat</w:t>
+      </w:r>
+      <w:proofErr w:type="spellEnd"/>
+      <w:r>
+        <w:rPr>
+          <w:rFonts w:ascii="Times New Roman" w:hAnsi="Times New Roman" w:cs="Times New Roman"/>
+        </w:rPr>
+        <w:t xml:space="preserve"> </w:t>
+      </w:r>
+      <w:proofErr w:type="spellStart"/>
+      <w:r>
+        <w:rPr>
+          <w:rFonts w:ascii="Times New Roman" w:hAnsi="Times New Roman" w:cs="Times New Roman"/>
+        </w:rPr>
+        <w:t>atribut</w:t>
+      </w:r>
+      <w:proofErr w:type="spellEnd"/>
+      <w:r>
+        <w:rPr>
+          <w:rFonts w:ascii="Times New Roman" w:hAnsi="Times New Roman" w:cs="Times New Roman"/>
+        </w:rPr>
+        <w:t xml:space="preserve"> </w:t>
+      </w:r>
+      <w:proofErr w:type="spellStart"/>
+      <w:r>
+        <w:rPr>
+          <w:rFonts w:ascii="Times New Roman" w:hAnsi="Times New Roman" w:cs="Times New Roman"/>
+        </w:rPr>
+        <w:t>dalam</w:t>
+      </w:r>
+      <w:proofErr w:type="spellEnd"/>
+      <w:r>
+        <w:rPr>
+          <w:rFonts w:ascii="Times New Roman" w:hAnsi="Times New Roman" w:cs="Times New Roman"/>
+        </w:rPr>
+        <w:t xml:space="preserve"> </w:t>
+      </w:r>
+      <w:proofErr w:type="spellStart"/>
+      <w:r>
+        <w:rPr>
+          <w:rFonts w:ascii="Times New Roman" w:hAnsi="Times New Roman" w:cs="Times New Roman"/>
+        </w:rPr>
+        <w:t>memberikan</w:t>
+      </w:r>
+      <w:proofErr w:type="spellEnd"/>
+      <w:r>
+        <w:rPr>
+          <w:rFonts w:ascii="Times New Roman" w:hAnsi="Times New Roman" w:cs="Times New Roman"/>
+        </w:rPr>
+        <w:t xml:space="preserve"> </w:t>
+      </w:r>
+      <w:proofErr w:type="spellStart"/>
+      <w:r>
+        <w:rPr>
+          <w:rFonts w:ascii="Times New Roman" w:hAnsi="Times New Roman" w:cs="Times New Roman"/>
+        </w:rPr>
+        <w:t>informasi</w:t>
+      </w:r>
+      <w:proofErr w:type="spellEnd"/>
+      <w:r>
+        <w:rPr>
+          <w:rFonts w:ascii="Times New Roman" w:hAnsi="Times New Roman" w:cs="Times New Roman"/>
+        </w:rPr>
+        <w:t xml:space="preserve"> </w:t>
+      </w:r>
+      <w:proofErr w:type="spellStart"/>
+      <w:r>
+        <w:rPr>
+          <w:rFonts w:ascii="Times New Roman" w:hAnsi="Times New Roman" w:cs="Times New Roman"/>
+        </w:rPr>
+        <w:t>klasifikasi</w:t>
+      </w:r>
+      <w:proofErr w:type="spellEnd"/>
+      <w:r>
+        <w:rPr>
+          <w:rFonts w:ascii="Times New Roman" w:hAnsi="Times New Roman" w:cs="Times New Roman"/>
+        </w:rPr>
+        <w:t xml:space="preserve"> yang </w:t>
+      </w:r>
+      <w:proofErr w:type="spellStart"/>
+      <w:r>
+        <w:rPr>
+          <w:rFonts w:ascii="Times New Roman" w:hAnsi="Times New Roman" w:cs="Times New Roman"/>
+        </w:rPr>
+        <w:t>lebih</w:t>
+      </w:r>
+      <w:proofErr w:type="spellEnd"/>
+      <w:r>
+        <w:rPr>
+          <w:rFonts w:ascii="Times New Roman" w:hAnsi="Times New Roman" w:cs="Times New Roman"/>
+        </w:rPr>
+        <w:t xml:space="preserve"> detail pada </w:t>
+      </w:r>
+      <w:proofErr w:type="spellStart"/>
+      <w:r>
+        <w:rPr>
+          <w:rFonts w:ascii="Times New Roman" w:hAnsi="Times New Roman" w:cs="Times New Roman"/>
+        </w:rPr>
+        <w:t>hasil</w:t>
+      </w:r>
+      <w:proofErr w:type="spellEnd"/>
+      <w:r>
+        <w:rPr>
+          <w:rFonts w:ascii="Times New Roman" w:hAnsi="Times New Roman" w:cs="Times New Roman"/>
+        </w:rPr>
+        <w:t xml:space="preserve"> </w:t>
+      </w:r>
+      <w:proofErr w:type="spellStart"/>
+      <w:r>
+        <w:rPr>
+          <w:rFonts w:ascii="Times New Roman" w:hAnsi="Times New Roman" w:cs="Times New Roman"/>
+        </w:rPr>
+        <w:t>klasifikasi</w:t>
+      </w:r>
+      <w:proofErr w:type="spellEnd"/>
+      <w:r>
+        <w:rPr>
+          <w:rFonts w:ascii="Times New Roman" w:hAnsi="Times New Roman" w:cs="Times New Roman"/>
+        </w:rPr>
+        <w:t xml:space="preserve"> yang </w:t>
+      </w:r>
+      <w:proofErr w:type="spellStart"/>
+      <w:r>
+        <w:rPr>
+          <w:rFonts w:ascii="Times New Roman" w:hAnsi="Times New Roman" w:cs="Times New Roman"/>
+        </w:rPr>
+        <w:t>dirancang</w:t>
+      </w:r>
+      <w:proofErr w:type="spellEnd"/>
+      <w:r>
+        <w:rPr>
+          <w:rFonts w:ascii="Times New Roman" w:hAnsi="Times New Roman" w:cs="Times New Roman"/>
+        </w:rPr>
+        <w:t xml:space="preserve">, dan </w:t>
+      </w:r>
+      <w:proofErr w:type="spellStart"/>
+      <w:r>
+        <w:rPr>
+          <w:rFonts w:ascii="Times New Roman" w:hAnsi="Times New Roman" w:cs="Times New Roman"/>
+        </w:rPr>
+        <w:t>manfaat</w:t>
+      </w:r>
+      <w:proofErr w:type="spellEnd"/>
+      <w:r>
+        <w:rPr>
+          <w:rFonts w:ascii="Times New Roman" w:hAnsi="Times New Roman" w:cs="Times New Roman"/>
+        </w:rPr>
+        <w:t xml:space="preserve"> </w:t>
+      </w:r>
+      <w:proofErr w:type="spellStart"/>
+      <w:r>
+        <w:rPr>
+          <w:rFonts w:ascii="Times New Roman" w:hAnsi="Times New Roman" w:cs="Times New Roman"/>
+        </w:rPr>
+        <w:t>dari</w:t>
+      </w:r>
+      <w:proofErr w:type="spellEnd"/>
+      <w:r>
+        <w:rPr>
+          <w:rFonts w:ascii="Times New Roman" w:hAnsi="Times New Roman" w:cs="Times New Roman"/>
+        </w:rPr>
+        <w:t xml:space="preserve"> </w:t>
+      </w:r>
+      <w:proofErr w:type="spellStart"/>
+      <w:r>
+        <w:rPr>
+          <w:rFonts w:ascii="Times New Roman" w:hAnsi="Times New Roman" w:cs="Times New Roman"/>
+        </w:rPr>
+        <w:t>informasi</w:t>
+      </w:r>
+      <w:proofErr w:type="spellEnd"/>
+      <w:r>
+        <w:rPr>
+          <w:rFonts w:ascii="Times New Roman" w:hAnsi="Times New Roman" w:cs="Times New Roman"/>
+        </w:rPr>
+        <w:t xml:space="preserve"> diagnosis yang </w:t>
+      </w:r>
+      <w:proofErr w:type="spellStart"/>
+      <w:r>
+        <w:rPr>
+          <w:rFonts w:ascii="Times New Roman" w:hAnsi="Times New Roman" w:cs="Times New Roman"/>
+        </w:rPr>
+        <w:t>disimpan</w:t>
+      </w:r>
+      <w:proofErr w:type="spellEnd"/>
+      <w:r>
+        <w:rPr>
+          <w:rFonts w:ascii="Times New Roman" w:hAnsi="Times New Roman" w:cs="Times New Roman"/>
+        </w:rPr>
+        <w:t xml:space="preserve"> oleh </w:t>
+      </w:r>
+      <w:proofErr w:type="spellStart"/>
+      <w:r>
+        <w:rPr>
+          <w:rFonts w:ascii="Times New Roman" w:hAnsi="Times New Roman" w:cs="Times New Roman"/>
+        </w:rPr>
+        <w:t>atribut</w:t>
+      </w:r>
+      <w:proofErr w:type="spellEnd"/>
+      <w:r>
+        <w:rPr>
+          <w:rFonts w:ascii="Times New Roman" w:hAnsi="Times New Roman" w:cs="Times New Roman"/>
+        </w:rPr>
+        <w:t xml:space="preserve">. </w:t>
+      </w:r>
+      <w:proofErr w:type="spellStart"/>
+      <w:r>
+        <w:rPr>
+          <w:rFonts w:ascii="Times New Roman" w:hAnsi="Times New Roman" w:cs="Times New Roman"/>
+        </w:rPr>
+        <w:t>Walaupun</w:t>
+      </w:r>
+      <w:proofErr w:type="spellEnd"/>
+      <w:r>
+        <w:rPr>
+          <w:rFonts w:ascii="Times New Roman" w:hAnsi="Times New Roman" w:cs="Times New Roman"/>
+        </w:rPr>
+        <w:t xml:space="preserve"> </w:t>
+      </w:r>
+      <w:proofErr w:type="spellStart"/>
+      <w:r>
+        <w:rPr>
+          <w:rFonts w:ascii="Times New Roman" w:hAnsi="Times New Roman" w:cs="Times New Roman"/>
+        </w:rPr>
+        <w:t>demikian</w:t>
+      </w:r>
+      <w:proofErr w:type="spellEnd"/>
+      <w:r>
+        <w:rPr>
+          <w:rFonts w:ascii="Times New Roman" w:hAnsi="Times New Roman" w:cs="Times New Roman"/>
+        </w:rPr>
+        <w:t xml:space="preserve">, </w:t>
+      </w:r>
+      <w:proofErr w:type="spellStart"/>
+      <w:r>
+        <w:rPr>
+          <w:rFonts w:ascii="Times New Roman" w:hAnsi="Times New Roman" w:cs="Times New Roman"/>
+        </w:rPr>
+        <w:t>atribut-atribut</w:t>
+      </w:r>
+      <w:proofErr w:type="spellEnd"/>
+      <w:r>
+        <w:rPr>
+          <w:rFonts w:ascii="Times New Roman" w:hAnsi="Times New Roman" w:cs="Times New Roman"/>
+        </w:rPr>
+        <w:t xml:space="preserve"> </w:t>
+      </w:r>
+      <w:proofErr w:type="spellStart"/>
+      <w:r>
+        <w:rPr>
+          <w:rFonts w:ascii="Times New Roman" w:hAnsi="Times New Roman" w:cs="Times New Roman"/>
+        </w:rPr>
+        <w:t>ini</w:t>
+      </w:r>
+      <w:proofErr w:type="spellEnd"/>
+      <w:r>
+        <w:rPr>
+          <w:rFonts w:ascii="Times New Roman" w:hAnsi="Times New Roman" w:cs="Times New Roman"/>
+        </w:rPr>
+        <w:t xml:space="preserve"> </w:t>
+      </w:r>
+      <w:proofErr w:type="spellStart"/>
+      <w:r>
+        <w:rPr>
+          <w:rFonts w:ascii="Times New Roman" w:hAnsi="Times New Roman" w:cs="Times New Roman"/>
+        </w:rPr>
+        <w:t>akan</w:t>
+      </w:r>
+      <w:proofErr w:type="spellEnd"/>
+      <w:r>
+        <w:rPr>
+          <w:rFonts w:ascii="Times New Roman" w:hAnsi="Times New Roman" w:cs="Times New Roman"/>
+        </w:rPr>
+        <w:t xml:space="preserve"> </w:t>
+      </w:r>
+      <w:proofErr w:type="spellStart"/>
+      <w:r>
+        <w:rPr>
+          <w:rFonts w:ascii="Times New Roman" w:hAnsi="Times New Roman" w:cs="Times New Roman"/>
+        </w:rPr>
+        <w:t>diperbaharui</w:t>
+      </w:r>
+      <w:proofErr w:type="spellEnd"/>
+      <w:r>
+        <w:rPr>
+          <w:rFonts w:ascii="Times New Roman" w:hAnsi="Times New Roman" w:cs="Times New Roman"/>
+        </w:rPr>
+        <w:t xml:space="preserve"> </w:t>
+      </w:r>
+      <w:proofErr w:type="spellStart"/>
+      <w:r>
+        <w:rPr>
+          <w:rFonts w:ascii="Times New Roman" w:hAnsi="Times New Roman" w:cs="Times New Roman"/>
+        </w:rPr>
+        <w:t>dengan</w:t>
+      </w:r>
+      <w:proofErr w:type="spellEnd"/>
+      <w:r>
+        <w:rPr>
+          <w:rFonts w:ascii="Times New Roman" w:hAnsi="Times New Roman" w:cs="Times New Roman"/>
+        </w:rPr>
+        <w:t xml:space="preserve"> </w:t>
+      </w:r>
+      <w:proofErr w:type="spellStart"/>
+      <w:r>
+        <w:rPr>
+          <w:rFonts w:ascii="Times New Roman" w:hAnsi="Times New Roman" w:cs="Times New Roman"/>
+        </w:rPr>
+        <w:t>menerapkan</w:t>
+      </w:r>
+      <w:proofErr w:type="spellEnd"/>
+      <w:r>
+        <w:rPr>
+          <w:rFonts w:ascii="Times New Roman" w:hAnsi="Times New Roman" w:cs="Times New Roman"/>
+        </w:rPr>
+        <w:t xml:space="preserve"> </w:t>
+      </w:r>
+      <w:proofErr w:type="spellStart"/>
+      <w:r>
+        <w:rPr>
+          <w:rFonts w:ascii="Times New Roman" w:hAnsi="Times New Roman" w:cs="Times New Roman"/>
+        </w:rPr>
+        <w:t>tahapan</w:t>
+      </w:r>
+      <w:proofErr w:type="spellEnd"/>
+      <w:r>
+        <w:rPr>
+          <w:rFonts w:ascii="Times New Roman" w:hAnsi="Times New Roman" w:cs="Times New Roman"/>
+        </w:rPr>
+        <w:t xml:space="preserve"> </w:t>
+      </w:r>
+      <w:r>
+        <w:rPr>
+          <w:rFonts w:ascii="Times New Roman" w:hAnsi="Times New Roman" w:cs="Times New Roman"/>
+          <w:i/>
+          <w:iCs/>
+        </w:rPr>
+        <w:t>pre</w:t>
+      </w:r>
+      <w:r>
+        <w:rPr>
+          <w:rFonts w:ascii="Times New Roman" w:hAnsi="Times New Roman" w:cs="Times New Roman"/>
+          <w:i/>
+          <w:iCs/>
+        </w:rPr>
+        <w:t>-</w:t>
+      </w:r>
+      <w:r>
+        <w:rPr>
+          <w:rFonts w:ascii="Times New Roman" w:hAnsi="Times New Roman" w:cs="Times New Roman"/>
+          <w:i/>
+          <w:iCs/>
+        </w:rPr>
+        <w:t>processing</w:t>
+      </w:r>
+      <w:r>
+        <w:rPr>
+          <w:rFonts w:ascii="Times New Roman" w:hAnsi="Times New Roman" w:cs="Times New Roman"/>
+        </w:rPr>
+        <w:t xml:space="preserve"> </w:t>
+      </w:r>
+      <w:proofErr w:type="spellStart"/>
+      <w:r>
+        <w:rPr>
+          <w:rFonts w:ascii="Times New Roman" w:hAnsi="Times New Roman" w:cs="Times New Roman"/>
+        </w:rPr>
+        <w:t>untuk</w:t>
+      </w:r>
+      <w:proofErr w:type="spellEnd"/>
+      <w:r>
+        <w:rPr>
+          <w:rFonts w:ascii="Times New Roman" w:hAnsi="Times New Roman" w:cs="Times New Roman"/>
+        </w:rPr>
+        <w:t xml:space="preserve"> </w:t>
+      </w:r>
+      <w:proofErr w:type="spellStart"/>
+      <w:r>
+        <w:rPr>
+          <w:rFonts w:ascii="Times New Roman" w:hAnsi="Times New Roman" w:cs="Times New Roman"/>
+        </w:rPr>
+        <w:t>memastikan</w:t>
+      </w:r>
+      <w:proofErr w:type="spellEnd"/>
+      <w:r>
+        <w:rPr>
+          <w:rFonts w:ascii="Times New Roman" w:hAnsi="Times New Roman" w:cs="Times New Roman"/>
+        </w:rPr>
+        <w:t xml:space="preserve"> data yang </w:t>
+      </w:r>
+      <w:r>
+        <w:rPr>
+          <w:rFonts w:ascii="Times New Roman" w:hAnsi="Times New Roman" w:cs="Times New Roman"/>
+          <w:i/>
+          <w:iCs/>
+        </w:rPr>
+        <w:t>clean</w:t>
+      </w:r>
+      <w:r>
+        <w:rPr>
+          <w:rFonts w:ascii="Times New Roman" w:hAnsi="Times New Roman" w:cs="Times New Roman"/>
+        </w:rPr>
+        <w:t xml:space="preserve">, </w:t>
+      </w:r>
+      <w:proofErr w:type="spellStart"/>
+      <w:r>
+        <w:rPr>
+          <w:rFonts w:ascii="Times New Roman" w:hAnsi="Times New Roman" w:cs="Times New Roman"/>
+        </w:rPr>
+        <w:t>tidak</w:t>
+      </w:r>
+      <w:proofErr w:type="spellEnd"/>
+      <w:r>
+        <w:rPr>
+          <w:rFonts w:ascii="Times New Roman" w:hAnsi="Times New Roman" w:cs="Times New Roman"/>
+        </w:rPr>
+        <w:t xml:space="preserve"> </w:t>
+      </w:r>
+      <w:r>
+        <w:rPr>
+          <w:rFonts w:ascii="Times New Roman" w:hAnsi="Times New Roman" w:cs="Times New Roman"/>
+          <w:i/>
+          <w:iCs/>
+        </w:rPr>
+        <w:t>noise</w:t>
+      </w:r>
+      <w:r>
+        <w:rPr>
+          <w:rFonts w:ascii="Times New Roman" w:hAnsi="Times New Roman" w:cs="Times New Roman"/>
+        </w:rPr>
+        <w:t xml:space="preserve">, </w:t>
+      </w:r>
+      <w:proofErr w:type="spellStart"/>
+      <w:r>
+        <w:rPr>
+          <w:rFonts w:ascii="Times New Roman" w:hAnsi="Times New Roman" w:cs="Times New Roman"/>
+        </w:rPr>
+        <w:t>tidak</w:t>
+      </w:r>
+      <w:proofErr w:type="spellEnd"/>
+      <w:r>
+        <w:rPr>
+          <w:rFonts w:ascii="Times New Roman" w:hAnsi="Times New Roman" w:cs="Times New Roman"/>
+        </w:rPr>
+        <w:t xml:space="preserve"> </w:t>
+      </w:r>
+      <w:r>
+        <w:rPr>
+          <w:rFonts w:ascii="Times New Roman" w:hAnsi="Times New Roman" w:cs="Times New Roman"/>
+          <w:i/>
+          <w:iCs/>
+        </w:rPr>
+        <w:t>outlier</w:t>
+      </w:r>
+      <w:r>
+        <w:rPr>
+          <w:rFonts w:ascii="Times New Roman" w:hAnsi="Times New Roman" w:cs="Times New Roman"/>
+        </w:rPr>
+        <w:t xml:space="preserve">, dan </w:t>
+      </w:r>
+      <w:proofErr w:type="spellStart"/>
+      <w:r>
+        <w:rPr>
+          <w:rFonts w:ascii="Times New Roman" w:hAnsi="Times New Roman" w:cs="Times New Roman"/>
+        </w:rPr>
+        <w:t>terdistribusi</w:t>
+      </w:r>
+      <w:proofErr w:type="spellEnd"/>
+      <w:r>
+        <w:rPr>
+          <w:rFonts w:ascii="Times New Roman" w:hAnsi="Times New Roman" w:cs="Times New Roman"/>
+        </w:rPr>
+        <w:t xml:space="preserve"> </w:t>
+      </w:r>
+      <w:proofErr w:type="spellStart"/>
+      <w:r>
+        <w:rPr>
+          <w:rFonts w:ascii="Times New Roman" w:hAnsi="Times New Roman" w:cs="Times New Roman"/>
+        </w:rPr>
+        <w:t>dengan</w:t>
+      </w:r>
+      <w:proofErr w:type="spellEnd"/>
+      <w:r>
+        <w:rPr>
+          <w:rFonts w:ascii="Times New Roman" w:hAnsi="Times New Roman" w:cs="Times New Roman"/>
+        </w:rPr>
+        <w:t xml:space="preserve"> </w:t>
+      </w:r>
+      <w:proofErr w:type="spellStart"/>
+      <w:r>
+        <w:rPr>
+          <w:rFonts w:ascii="Times New Roman" w:hAnsi="Times New Roman" w:cs="Times New Roman"/>
+        </w:rPr>
+        <w:t>baik</w:t>
+      </w:r>
+      <w:proofErr w:type="spellEnd"/>
+      <w:r>
+        <w:rPr>
+          <w:rFonts w:ascii="Times New Roman" w:hAnsi="Times New Roman" w:cs="Times New Roman"/>
+        </w:rPr>
+        <w:t xml:space="preserve">. </w:t>
+      </w:r>
+      <w:proofErr w:type="spellStart"/>
+      <w:r>
+        <w:rPr>
+          <w:rFonts w:ascii="Times New Roman" w:hAnsi="Times New Roman" w:cs="Times New Roman"/>
+        </w:rPr>
+        <w:t>Disamping</w:t>
+      </w:r>
+      <w:proofErr w:type="spellEnd"/>
+      <w:r>
+        <w:rPr>
+          <w:rFonts w:ascii="Times New Roman" w:hAnsi="Times New Roman" w:cs="Times New Roman"/>
+        </w:rPr>
+        <w:t xml:space="preserve"> </w:t>
+      </w:r>
+      <w:proofErr w:type="spellStart"/>
+      <w:r>
+        <w:rPr>
+          <w:rFonts w:ascii="Times New Roman" w:hAnsi="Times New Roman" w:cs="Times New Roman"/>
+        </w:rPr>
+        <w:t>itu</w:t>
+      </w:r>
+      <w:proofErr w:type="spellEnd"/>
+      <w:r>
+        <w:rPr>
+          <w:rFonts w:ascii="Times New Roman" w:hAnsi="Times New Roman" w:cs="Times New Roman"/>
+        </w:rPr>
+        <w:t xml:space="preserve"> </w:t>
+      </w:r>
+      <w:proofErr w:type="spellStart"/>
+      <w:r>
+        <w:rPr>
+          <w:rFonts w:ascii="Times New Roman" w:hAnsi="Times New Roman" w:cs="Times New Roman"/>
+        </w:rPr>
+        <w:t>akan</w:t>
+      </w:r>
+      <w:proofErr w:type="spellEnd"/>
+      <w:r>
+        <w:rPr>
+          <w:rFonts w:ascii="Times New Roman" w:hAnsi="Times New Roman" w:cs="Times New Roman"/>
+        </w:rPr>
+        <w:t xml:space="preserve"> </w:t>
+      </w:r>
+      <w:proofErr w:type="spellStart"/>
+      <w:r>
+        <w:rPr>
+          <w:rFonts w:ascii="Times New Roman" w:hAnsi="Times New Roman" w:cs="Times New Roman"/>
+        </w:rPr>
+        <w:t>dilakukan</w:t>
+      </w:r>
+      <w:proofErr w:type="spellEnd"/>
+      <w:r>
+        <w:rPr>
+          <w:rFonts w:ascii="Times New Roman" w:hAnsi="Times New Roman" w:cs="Times New Roman"/>
+        </w:rPr>
+        <w:t xml:space="preserve"> </w:t>
+      </w:r>
+      <w:proofErr w:type="spellStart"/>
+      <w:r>
+        <w:rPr>
+          <w:rFonts w:ascii="Times New Roman" w:hAnsi="Times New Roman" w:cs="Times New Roman"/>
+        </w:rPr>
+        <w:t>beberapa</w:t>
+      </w:r>
+      <w:proofErr w:type="spellEnd"/>
+      <w:r>
+        <w:rPr>
+          <w:rFonts w:ascii="Times New Roman" w:hAnsi="Times New Roman" w:cs="Times New Roman"/>
+        </w:rPr>
+        <w:t xml:space="preserve"> </w:t>
+      </w:r>
+      <w:proofErr w:type="spellStart"/>
+      <w:r>
+        <w:rPr>
+          <w:rFonts w:ascii="Times New Roman" w:hAnsi="Times New Roman" w:cs="Times New Roman"/>
+        </w:rPr>
+        <w:t>pengaturan</w:t>
+      </w:r>
+      <w:proofErr w:type="spellEnd"/>
+      <w:r>
+        <w:rPr>
+          <w:rFonts w:ascii="Times New Roman" w:hAnsi="Times New Roman" w:cs="Times New Roman"/>
+        </w:rPr>
+        <w:t xml:space="preserve"> pada </w:t>
+      </w:r>
+      <w:proofErr w:type="spellStart"/>
+      <w:r>
+        <w:rPr>
+          <w:rFonts w:ascii="Times New Roman" w:hAnsi="Times New Roman" w:cs="Times New Roman"/>
+        </w:rPr>
+        <w:t>isi</w:t>
+      </w:r>
+      <w:proofErr w:type="spellEnd"/>
+      <w:r>
+        <w:rPr>
+          <w:rFonts w:ascii="Times New Roman" w:hAnsi="Times New Roman" w:cs="Times New Roman"/>
+        </w:rPr>
+        <w:t xml:space="preserve"> </w:t>
+      </w:r>
+      <w:proofErr w:type="spellStart"/>
+      <w:r>
+        <w:rPr>
+          <w:rFonts w:ascii="Times New Roman" w:hAnsi="Times New Roman" w:cs="Times New Roman"/>
+        </w:rPr>
+        <w:t>atribut-atribut</w:t>
+      </w:r>
+      <w:proofErr w:type="spellEnd"/>
+      <w:r>
+        <w:rPr>
+          <w:rFonts w:ascii="Times New Roman" w:hAnsi="Times New Roman" w:cs="Times New Roman"/>
+        </w:rPr>
+        <w:t xml:space="preserve"> </w:t>
+      </w:r>
+      <w:proofErr w:type="spellStart"/>
+      <w:r>
+        <w:rPr>
+          <w:rFonts w:ascii="Times New Roman" w:hAnsi="Times New Roman" w:cs="Times New Roman"/>
+        </w:rPr>
+        <w:t>tertentu</w:t>
+      </w:r>
+      <w:proofErr w:type="spellEnd"/>
+      <w:r>
+        <w:rPr>
+          <w:rFonts w:ascii="Times New Roman" w:hAnsi="Times New Roman" w:cs="Times New Roman"/>
+        </w:rPr>
+        <w:t xml:space="preserve"> yang </w:t>
+      </w:r>
+      <w:proofErr w:type="spellStart"/>
+      <w:r>
+        <w:rPr>
+          <w:rFonts w:ascii="Times New Roman" w:hAnsi="Times New Roman" w:cs="Times New Roman"/>
+        </w:rPr>
+        <w:t>disesuaikan</w:t>
+      </w:r>
+      <w:proofErr w:type="spellEnd"/>
+      <w:r>
+        <w:rPr>
+          <w:rFonts w:ascii="Times New Roman" w:hAnsi="Times New Roman" w:cs="Times New Roman"/>
+        </w:rPr>
+        <w:t xml:space="preserve"> </w:t>
+      </w:r>
+      <w:proofErr w:type="spellStart"/>
+      <w:r>
+        <w:rPr>
+          <w:rFonts w:ascii="Times New Roman" w:hAnsi="Times New Roman" w:cs="Times New Roman"/>
+        </w:rPr>
+        <w:t>dengan</w:t>
+      </w:r>
+      <w:proofErr w:type="spellEnd"/>
+      <w:r>
+        <w:rPr>
+          <w:rFonts w:ascii="Times New Roman" w:hAnsi="Times New Roman" w:cs="Times New Roman"/>
+        </w:rPr>
+        <w:t xml:space="preserve"> </w:t>
+      </w:r>
+      <w:proofErr w:type="spellStart"/>
+      <w:r>
+        <w:rPr>
+          <w:rFonts w:ascii="Times New Roman" w:hAnsi="Times New Roman" w:cs="Times New Roman"/>
+        </w:rPr>
+        <w:t>informasi</w:t>
+      </w:r>
+      <w:proofErr w:type="spellEnd"/>
+      <w:r>
+        <w:rPr>
+          <w:rFonts w:ascii="Times New Roman" w:hAnsi="Times New Roman" w:cs="Times New Roman"/>
+        </w:rPr>
+        <w:t xml:space="preserve"> </w:t>
+      </w:r>
+      <w:proofErr w:type="spellStart"/>
+      <w:r>
+        <w:rPr>
+          <w:rFonts w:ascii="Times New Roman" w:hAnsi="Times New Roman" w:cs="Times New Roman"/>
+        </w:rPr>
+        <w:t>dari</w:t>
+      </w:r>
+      <w:proofErr w:type="spellEnd"/>
+      <w:r>
+        <w:rPr>
+          <w:rFonts w:ascii="Times New Roman" w:hAnsi="Times New Roman" w:cs="Times New Roman"/>
+        </w:rPr>
+        <w:t xml:space="preserve"> dataset </w:t>
+      </w:r>
+      <w:proofErr w:type="spellStart"/>
+      <w:r>
+        <w:rPr>
+          <w:rFonts w:ascii="Times New Roman" w:hAnsi="Times New Roman" w:cs="Times New Roman"/>
+        </w:rPr>
+        <w:t>sekunder</w:t>
+      </w:r>
+      <w:proofErr w:type="spellEnd"/>
+      <w:r>
+        <w:rPr>
+          <w:rFonts w:ascii="Times New Roman" w:hAnsi="Times New Roman" w:cs="Times New Roman"/>
+        </w:rPr>
+        <w:t xml:space="preserve">. Hal </w:t>
+      </w:r>
+      <w:proofErr w:type="spellStart"/>
+      <w:r>
+        <w:rPr>
+          <w:rFonts w:ascii="Times New Roman" w:hAnsi="Times New Roman" w:cs="Times New Roman"/>
+        </w:rPr>
+        <w:t>ini</w:t>
+      </w:r>
+      <w:proofErr w:type="spellEnd"/>
+      <w:r>
+        <w:rPr>
+          <w:rFonts w:ascii="Times New Roman" w:hAnsi="Times New Roman" w:cs="Times New Roman"/>
+        </w:rPr>
+        <w:t xml:space="preserve"> </w:t>
+      </w:r>
+      <w:proofErr w:type="spellStart"/>
+      <w:r>
+        <w:rPr>
+          <w:rFonts w:ascii="Times New Roman" w:hAnsi="Times New Roman" w:cs="Times New Roman"/>
+        </w:rPr>
+        <w:t>bertujuan</w:t>
+      </w:r>
+      <w:proofErr w:type="spellEnd"/>
+      <w:r>
+        <w:rPr>
+          <w:rFonts w:ascii="Times New Roman" w:hAnsi="Times New Roman" w:cs="Times New Roman"/>
+        </w:rPr>
+        <w:t xml:space="preserve"> </w:t>
+      </w:r>
+      <w:proofErr w:type="spellStart"/>
+      <w:r>
+        <w:rPr>
+          <w:rFonts w:ascii="Times New Roman" w:hAnsi="Times New Roman" w:cs="Times New Roman"/>
+        </w:rPr>
+        <w:t>untuk</w:t>
+      </w:r>
+      <w:proofErr w:type="spellEnd"/>
+      <w:r>
+        <w:rPr>
+          <w:rFonts w:ascii="Times New Roman" w:hAnsi="Times New Roman" w:cs="Times New Roman"/>
+        </w:rPr>
+        <w:t xml:space="preserve"> </w:t>
+      </w:r>
+      <w:proofErr w:type="spellStart"/>
+      <w:r>
+        <w:rPr>
+          <w:rFonts w:ascii="Times New Roman" w:hAnsi="Times New Roman" w:cs="Times New Roman"/>
+        </w:rPr>
+        <w:t>memaksimalkan</w:t>
+      </w:r>
+      <w:proofErr w:type="spellEnd"/>
+      <w:r>
+        <w:rPr>
+          <w:rFonts w:ascii="Times New Roman" w:hAnsi="Times New Roman" w:cs="Times New Roman"/>
+        </w:rPr>
+        <w:t xml:space="preserve"> </w:t>
+      </w:r>
+      <w:proofErr w:type="spellStart"/>
+      <w:r>
+        <w:rPr>
+          <w:rFonts w:ascii="Times New Roman" w:hAnsi="Times New Roman" w:cs="Times New Roman"/>
+        </w:rPr>
+        <w:t>informasi</w:t>
+      </w:r>
+      <w:proofErr w:type="spellEnd"/>
+      <w:r>
+        <w:rPr>
+          <w:rFonts w:ascii="Times New Roman" w:hAnsi="Times New Roman" w:cs="Times New Roman"/>
+        </w:rPr>
+        <w:t xml:space="preserve"> yang kaya </w:t>
+      </w:r>
+      <w:proofErr w:type="spellStart"/>
+      <w:r>
+        <w:rPr>
+          <w:rFonts w:ascii="Times New Roman" w:hAnsi="Times New Roman" w:cs="Times New Roman"/>
+        </w:rPr>
+        <w:t>kedalam</w:t>
+      </w:r>
+      <w:proofErr w:type="spellEnd"/>
+      <w:r>
+        <w:rPr>
+          <w:rFonts w:ascii="Times New Roman" w:hAnsi="Times New Roman" w:cs="Times New Roman"/>
+        </w:rPr>
+        <w:t xml:space="preserve"> </w:t>
+      </w:r>
+      <w:proofErr w:type="spellStart"/>
+      <w:r>
+        <w:rPr>
+          <w:rFonts w:ascii="Times New Roman" w:hAnsi="Times New Roman" w:cs="Times New Roman"/>
+        </w:rPr>
+        <w:t>atribut</w:t>
+      </w:r>
+      <w:proofErr w:type="spellEnd"/>
+      <w:r>
+        <w:rPr>
+          <w:rFonts w:ascii="Times New Roman" w:hAnsi="Times New Roman" w:cs="Times New Roman"/>
+        </w:rPr>
+        <w:t xml:space="preserve"> </w:t>
+      </w:r>
+      <w:proofErr w:type="spellStart"/>
+      <w:r>
+        <w:rPr>
+          <w:rFonts w:ascii="Times New Roman" w:hAnsi="Times New Roman" w:cs="Times New Roman"/>
+        </w:rPr>
+        <w:t>sehingga</w:t>
+      </w:r>
+      <w:proofErr w:type="spellEnd"/>
+      <w:r>
+        <w:rPr>
+          <w:rFonts w:ascii="Times New Roman" w:hAnsi="Times New Roman" w:cs="Times New Roman"/>
+        </w:rPr>
+        <w:t xml:space="preserve"> </w:t>
+      </w:r>
+      <w:proofErr w:type="spellStart"/>
+      <w:r>
+        <w:rPr>
+          <w:rFonts w:ascii="Times New Roman" w:hAnsi="Times New Roman" w:cs="Times New Roman"/>
+        </w:rPr>
+        <w:t>mampu</w:t>
+      </w:r>
+      <w:proofErr w:type="spellEnd"/>
+      <w:r>
+        <w:rPr>
+          <w:rFonts w:ascii="Times New Roman" w:hAnsi="Times New Roman" w:cs="Times New Roman"/>
+        </w:rPr>
+        <w:t xml:space="preserve"> </w:t>
+      </w:r>
+      <w:proofErr w:type="spellStart"/>
+      <w:r>
+        <w:rPr>
+          <w:rFonts w:ascii="Times New Roman" w:hAnsi="Times New Roman" w:cs="Times New Roman"/>
+        </w:rPr>
+        <w:t>memberikan</w:t>
+      </w:r>
+      <w:proofErr w:type="spellEnd"/>
+      <w:r>
+        <w:rPr>
+          <w:rFonts w:ascii="Times New Roman" w:hAnsi="Times New Roman" w:cs="Times New Roman"/>
+        </w:rPr>
+        <w:t xml:space="preserve"> </w:t>
+      </w:r>
+      <w:proofErr w:type="spellStart"/>
+      <w:r>
+        <w:rPr>
+          <w:rFonts w:ascii="Times New Roman" w:hAnsi="Times New Roman" w:cs="Times New Roman"/>
+        </w:rPr>
+        <w:t>klasifikasi</w:t>
+      </w:r>
+      <w:proofErr w:type="spellEnd"/>
+      <w:r>
+        <w:rPr>
+          <w:rFonts w:ascii="Times New Roman" w:hAnsi="Times New Roman" w:cs="Times New Roman"/>
+        </w:rPr>
+        <w:t xml:space="preserve"> </w:t>
+      </w:r>
+      <w:proofErr w:type="spellStart"/>
+      <w:r>
+        <w:rPr>
+          <w:rFonts w:ascii="Times New Roman" w:hAnsi="Times New Roman" w:cs="Times New Roman"/>
+        </w:rPr>
+        <w:t>kunjungan</w:t>
+      </w:r>
+      <w:proofErr w:type="spellEnd"/>
+      <w:r>
+        <w:rPr>
+          <w:rFonts w:ascii="Times New Roman" w:hAnsi="Times New Roman" w:cs="Times New Roman"/>
+        </w:rPr>
+        <w:t xml:space="preserve"> </w:t>
+      </w:r>
+      <w:proofErr w:type="spellStart"/>
+      <w:r>
+        <w:rPr>
+          <w:rFonts w:ascii="Times New Roman" w:hAnsi="Times New Roman" w:cs="Times New Roman"/>
+        </w:rPr>
+        <w:t>sakit</w:t>
+      </w:r>
+      <w:proofErr w:type="spellEnd"/>
+      <w:r>
+        <w:rPr>
+          <w:rFonts w:ascii="Times New Roman" w:hAnsi="Times New Roman" w:cs="Times New Roman"/>
+        </w:rPr>
+        <w:t xml:space="preserve"> dan </w:t>
+      </w:r>
+      <w:proofErr w:type="spellStart"/>
+      <w:r>
+        <w:rPr>
+          <w:rFonts w:ascii="Times New Roman" w:hAnsi="Times New Roman" w:cs="Times New Roman"/>
+        </w:rPr>
+        <w:t>sehat</w:t>
+      </w:r>
+      <w:proofErr w:type="spellEnd"/>
+      <w:r>
+        <w:rPr>
+          <w:rFonts w:ascii="Times New Roman" w:hAnsi="Times New Roman" w:cs="Times New Roman"/>
+        </w:rPr>
+        <w:t xml:space="preserve"> yang </w:t>
+      </w:r>
+      <w:proofErr w:type="spellStart"/>
+      <w:r>
+        <w:rPr>
+          <w:rFonts w:ascii="Times New Roman" w:hAnsi="Times New Roman" w:cs="Times New Roman"/>
+        </w:rPr>
+        <w:t>lebih</w:t>
+      </w:r>
+      <w:proofErr w:type="spellEnd"/>
+      <w:r>
+        <w:rPr>
+          <w:rFonts w:ascii="Times New Roman" w:hAnsi="Times New Roman" w:cs="Times New Roman"/>
+        </w:rPr>
+        <w:t xml:space="preserve"> detail.</w:t>
+      </w:r>
+    </w:p>
+    <w:p>
+      <w:pPr>
         <w:pStyle w:val="Heading3"/>
         <w:spacing w:line="360" w:lineRule="auto"/>
         <w:rPr>
@@ -23912,6 +25732,7 @@
           <w:bCs/>
           <w:color w:val="auto"/>
         </w:rPr>
+        <w:lastRenderedPageBreak/>
         <w:t>3.1.3 Data Preparation</w:t>
       </w:r>
       <w:bookmarkEnd w:id="19"/>
@@ -25639,7 +27460,6 @@
         <w:rPr>
           <w:rFonts w:ascii="Times New Roman" w:hAnsi="Times New Roman" w:cs="Times New Roman"/>
         </w:rPr>
-        <w:lastRenderedPageBreak/>
         <w:t xml:space="preserve">Menyusun </w:t>
       </w:r>
       <w:proofErr w:type="spellStart"/>
@@ -26720,6 +28540,7 @@
         <w:rPr>
           <w:rFonts w:ascii="Times New Roman" w:hAnsi="Times New Roman" w:cs="Times New Roman"/>
         </w:rPr>
+        <w:lastRenderedPageBreak/>
         <w:t>Melakukan</w:t>
       </w:r>
       <w:proofErr w:type="spellEnd"/>
@@ -28054,7 +29875,6 @@
           <w:bCs/>
           <w:color w:val="auto"/>
         </w:rPr>
-        <w:lastRenderedPageBreak/>
         <w:t>3.</w:t>
       </w:r>
       <w:r>
@@ -28168,6 +29988,7 @@
           <w:bCs/>
           <w:color w:val="auto"/>
         </w:rPr>
+        <w:lastRenderedPageBreak/>
         <w:t>BAB IV</w:t>
       </w:r>
       <w:bookmarkEnd w:id="24"/>
@@ -30142,7 +31963,6 @@
           <w:kern w:val="0"/>
           <w:szCs w:val="24"/>
         </w:rPr>
-        <w:lastRenderedPageBreak/>
         <w:t>[8]</w:t>
       </w:r>
       <w:r>
@@ -31502,7 +33322,7 @@
   <w:abstractNum w:abstractNumId="13" w15:restartNumberingAfterBreak="0">
     <w:nsid w:val="6D342D1F"/>
     <w:multiLevelType w:val="hybridMultilevel"/>
-    <w:tmpl w:val="3A680DDE"/>
+    <w:tmpl w:val="A90486E6"/>
     <w:lvl w:ilvl="0" w:tplc="38090019">
       <w:start w:val="1"/>
       <w:numFmt w:val="lowerLetter"/>
@@ -31515,14 +33335,17 @@
         <w:rFonts w:hint="default"/>
       </w:rPr>
     </w:lvl>
-    <w:lvl w:ilvl="1" w:tplc="38090019" w:tentative="1">
+    <w:lvl w:ilvl="1" w:tplc="AB0ECB16">
       <w:start w:val="1"/>
-      <w:numFmt w:val="lowerLetter"/>
+      <w:numFmt w:val="decimal"/>
       <w:lvlText w:val="%2."/>
       <w:lvlJc w:val="left"/>
       <w:pPr>
         <w:ind w:left="1440" w:hanging="360"/>
       </w:pPr>
+      <w:rPr>
+        <w:rFonts w:hint="default"/>
+      </w:rPr>
     </w:lvl>
     <w:lvl w:ilvl="2" w:tplc="3809001B" w:tentative="1">
       <w:start w:val="1"/>

</xml_diff>